<commit_message>
upd: groups and listeners
</commit_message>
<xml_diff>
--- a/docs/enrollment_order.docx
+++ b/docs/enrollment_order.docx
@@ -37,25 +37,7 @@
           <w:color w:val="000000" w:themeColor="text1"/>
           <w:sz w:val="28"/>
         </w:rPr>
-        <w:t xml:space="preserve">имени В.Г. </w:t>
-      </w:r>
-      <w:proofErr w:type="spellStart"/>
-      <w:r>
-        <w:rPr>
-          <w:b/>
-          <w:color w:val="000000" w:themeColor="text1"/>
-          <w:sz w:val="28"/>
-        </w:rPr>
-        <w:t>Тимирясова</w:t>
-      </w:r>
-      <w:proofErr w:type="spellEnd"/>
-      <w:r>
-        <w:rPr>
-          <w:b/>
-          <w:color w:val="000000" w:themeColor="text1"/>
-          <w:sz w:val="28"/>
-        </w:rPr>
-        <w:t xml:space="preserve"> (ИЭУП)»</w:t>
+        <w:t>имени В.Г. Тимирясова (ИЭУП)»</w:t>
       </w:r>
     </w:p>
     <w:p>
@@ -120,9 +102,8 @@
           <w:u w:val="single"/>
           <w:lang w:val="en-US"/>
         </w:rPr>
-        <w:t>{</w:t>
-      </w:r>
-      <w:proofErr w:type="spellStart"/>
+        <w:t>{order_date_formatted}</w:t>
+      </w:r>
       <w:r>
         <w:rPr>
           <w:b/>
@@ -132,95 +113,27 @@
           <w:u w:val="single"/>
           <w:lang w:val="en-US"/>
         </w:rPr>
-        <w:t>order_date_formatted</w:t>
-      </w:r>
-      <w:proofErr w:type="spellEnd"/>
-      <w:r>
-        <w:rPr>
-          <w:b/>
-          <w:color w:val="000000" w:themeColor="text1"/>
-          <w:sz w:val="28"/>
-          <w:szCs w:val="28"/>
-          <w:u w:val="single"/>
-          <w:lang w:val="en-US"/>
-        </w:rPr>
-        <w:t>}</w:t>
-      </w:r>
-      <w:r>
-        <w:rPr>
-          <w:b/>
-          <w:color w:val="000000" w:themeColor="text1"/>
-          <w:sz w:val="28"/>
-          <w:szCs w:val="28"/>
-          <w:u w:val="single"/>
-          <w:lang w:val="en-US"/>
-        </w:rPr>
-        <w:t xml:space="preserve"> {</w:t>
-      </w:r>
-      <w:proofErr w:type="gramStart"/>
-      <w:r>
-        <w:rPr>
-          <w:b/>
-          <w:color w:val="000000" w:themeColor="text1"/>
-          <w:sz w:val="28"/>
-          <w:szCs w:val="28"/>
-          <w:u w:val="single"/>
-          <w:lang w:val="en-US"/>
-        </w:rPr>
-        <w:t>city}</w:t>
-      </w:r>
-      <w:r>
-        <w:rPr>
-          <w:b/>
-          <w:color w:val="000000" w:themeColor="text1"/>
-          <w:sz w:val="28"/>
-          <w:szCs w:val="28"/>
-          <w:lang w:val="en-US"/>
-        </w:rPr>
-        <w:t xml:space="preserve">   </w:t>
-      </w:r>
-      <w:proofErr w:type="gramEnd"/>
-      <w:r>
-        <w:rPr>
-          <w:b/>
-          <w:color w:val="000000" w:themeColor="text1"/>
-          <w:sz w:val="28"/>
-          <w:szCs w:val="28"/>
-          <w:lang w:val="en-US"/>
-        </w:rPr>
-        <w:t xml:space="preserve">№ </w:t>
-      </w:r>
-      <w:r>
-        <w:rPr>
-          <w:b/>
-          <w:color w:val="000000" w:themeColor="text1"/>
-          <w:sz w:val="28"/>
-          <w:szCs w:val="28"/>
-          <w:lang w:val="en-US"/>
-        </w:rPr>
-        <w:t>{</w:t>
-      </w:r>
-      <w:proofErr w:type="spellStart"/>
-      <w:r>
-        <w:rPr>
-          <w:b/>
-          <w:color w:val="000000" w:themeColor="text1"/>
-          <w:sz w:val="28"/>
-          <w:szCs w:val="28"/>
-          <w:lang w:val="en-US"/>
-        </w:rPr>
-        <w:t>order_number</w:t>
-      </w:r>
-      <w:proofErr w:type="spellEnd"/>
-      <w:r>
-        <w:rPr>
-          <w:b/>
-          <w:color w:val="000000" w:themeColor="text1"/>
-          <w:sz w:val="28"/>
-          <w:szCs w:val="28"/>
-          <w:lang w:val="en-US"/>
-        </w:rPr>
-        <w:t>}</w:t>
+        <w:t xml:space="preserve"> {city}</w:t>
+      </w:r>
+      <w:r>
+        <w:rPr>
+          <w:b/>
+          <w:color w:val="000000" w:themeColor="text1"/>
+          <w:sz w:val="28"/>
+          <w:szCs w:val="28"/>
+          <w:lang w:val="en-US"/>
+        </w:rPr>
+        <w:t xml:space="preserve">   № </w:t>
+      </w:r>
+      <w:r>
+        <w:rPr>
+          <w:b/>
+          <w:color w:val="000000" w:themeColor="text1"/>
+          <w:sz w:val="28"/>
+          <w:szCs w:val="28"/>
+          <w:lang w:val="en-US"/>
+        </w:rPr>
+        <w:t>{order_number}</w:t>
       </w:r>
     </w:p>
     <w:p>
@@ -410,6 +323,14 @@
           <w:sz w:val="28"/>
           <w:szCs w:val="28"/>
         </w:rPr>
+        <w:t xml:space="preserve"> часов</w:t>
+      </w:r>
+      <w:r>
+        <w:rPr>
+          <w:color w:val="000000" w:themeColor="text1"/>
+          <w:sz w:val="28"/>
+          <w:szCs w:val="28"/>
+        </w:rPr>
         <w:t xml:space="preserve"> с </w:t>
       </w:r>
       <w:r>
@@ -454,7 +375,6 @@
         </w:rPr>
         <w:t>_</w:t>
       </w:r>
-      <w:proofErr w:type="spellStart"/>
       <w:r>
         <w:rPr>
           <w:color w:val="000000" w:themeColor="text1"/>
@@ -464,7 +384,6 @@
         </w:rPr>
         <w:t>ru</w:t>
       </w:r>
-      <w:proofErr w:type="spellEnd"/>
       <w:r>
         <w:rPr>
           <w:color w:val="000000" w:themeColor="text1"/>
@@ -523,7 +442,6 @@
         </w:rPr>
         <w:t>_</w:t>
       </w:r>
-      <w:proofErr w:type="spellStart"/>
       <w:r>
         <w:rPr>
           <w:color w:val="000000" w:themeColor="text1"/>
@@ -533,7 +451,6 @@
         </w:rPr>
         <w:t>ru</w:t>
       </w:r>
-      <w:proofErr w:type="spellEnd"/>
       <w:r>
         <w:rPr>
           <w:color w:val="000000" w:themeColor="text1"/>
@@ -570,27 +487,7 @@
           <w:szCs w:val="28"/>
           <w:lang w:val="en-US"/>
         </w:rPr>
-        <w:t>{</w:t>
-      </w:r>
-      <w:proofErr w:type="spellStart"/>
-      <w:r>
-        <w:rPr>
-          <w:color w:val="000000" w:themeColor="text1"/>
-          <w:sz w:val="28"/>
-          <w:szCs w:val="28"/>
-          <w:lang w:val="en-US"/>
-        </w:rPr>
-        <w:t>listeners_numbered_list</w:t>
-      </w:r>
-      <w:proofErr w:type="spellEnd"/>
-      <w:r>
-        <w:rPr>
-          <w:color w:val="000000" w:themeColor="text1"/>
-          <w:sz w:val="28"/>
-          <w:szCs w:val="28"/>
-          <w:lang w:val="en-US"/>
-        </w:rPr>
-        <w:t>}</w:t>
+        <w:t>{listeners_numbered_list}</w:t>
       </w:r>
     </w:p>
     <w:p>
@@ -649,17 +546,7 @@
           <w:sz w:val="28"/>
           <w:szCs w:val="28"/>
         </w:rPr>
-        <w:t xml:space="preserve">Директор филиала                                                                   </w:t>
-      </w:r>
-      <w:proofErr w:type="gramStart"/>
-      <w:r>
-        <w:rPr>
-          <w:b/>
-          <w:color w:val="000000" w:themeColor="text1"/>
-          <w:sz w:val="28"/>
-          <w:szCs w:val="28"/>
-        </w:rPr>
-        <w:t xml:space="preserve">  </w:t>
+        <w:t xml:space="preserve">Директор филиала                                                                     </w:t>
       </w:r>
       <w:r>
         <w:rPr>
@@ -670,7 +557,6 @@
         </w:rPr>
         <w:t xml:space="preserve"> {</w:t>
       </w:r>
-      <w:proofErr w:type="gramEnd"/>
       <w:r>
         <w:rPr>
           <w:b/>
@@ -755,38 +641,7 @@
           <w:sz w:val="28"/>
           <w:szCs w:val="28"/>
         </w:rPr>
-        <w:t xml:space="preserve">Ответственный за направление                                  </w:t>
-      </w:r>
-      <w:proofErr w:type="gramStart"/>
-      <w:r>
-        <w:rPr>
-          <w:b/>
-          <w:color w:val="000000" w:themeColor="text1"/>
-          <w:sz w:val="28"/>
-          <w:szCs w:val="28"/>
-        </w:rPr>
-        <w:t xml:space="preserve">   {</w:t>
-      </w:r>
-      <w:proofErr w:type="spellStart"/>
-      <w:proofErr w:type="gramEnd"/>
-      <w:r>
-        <w:rPr>
-          <w:b/>
-          <w:color w:val="000000" w:themeColor="text1"/>
-          <w:sz w:val="28"/>
-          <w:szCs w:val="28"/>
-        </w:rPr>
-        <w:t>manager_name</w:t>
-      </w:r>
-      <w:proofErr w:type="spellEnd"/>
-      <w:r>
-        <w:rPr>
-          <w:b/>
-          <w:color w:val="000000" w:themeColor="text1"/>
-          <w:sz w:val="28"/>
-          <w:szCs w:val="28"/>
-        </w:rPr>
-        <w:t>}</w:t>
+        <w:t>Ответственный за направление                                     {manager_name}</w:t>
       </w:r>
     </w:p>
     <w:p>
@@ -1525,6 +1380,7 @@
   <w:style w:type="character" w:default="1" w:styleId="a0">
     <w:name w:val="Default Paragraph Font"/>
     <w:uiPriority w:val="1"/>
+    <w:semiHidden/>
     <w:unhideWhenUsed/>
   </w:style>
   <w:style w:type="table" w:default="1" w:styleId="a1">

</xml_diff>